<commit_message>
DBT-022 0.3.0: open books — naming the people we pay needs their consent
§1.7 adds five rows (#35–#39): consent from every natural person who invoiced
in 2025 (Christian Märtens already agreed), a transparency clause for new
contracts, the legal basis for counsel, payroll left out of the input VAT
book, and confidential prices in signed contracts. The letter to counsel
gains block 8, in the text and the Word file.

No ledger data enters this repository: the FY2025 book stays out until
these rows close.
</commit_message>
<xml_diff>
--- a/debt/DBT-022-questions-for-counsel.docx
+++ b/debt/DBT-022-questions-for-counsel.docx
@@ -29,7 +29,7 @@
         <w:t xml:space="preserve">Fecha: </w:t>
       </w:r>
       <w:r>
-        <w:t>29 de septiembre de 2026</w:t>
+        <w:t>30 de septiembre de 2026</w:t>
       </w:r>
     </w:p>
     <w:p>
@@ -641,6 +641,52 @@
         <w:pStyle w:val="Heading1"/>
       </w:pPr>
       <w:r>
+        <w:t>8. Cuentas abiertas: publicar lo que pagamos a personas</w:t>
+      </w:r>
+    </w:p>
+    <w:p>
+      <w:pPr/>
+      <w:r>
+        <w:t>Queremos publicar en numinia.org las cuentas reales de la empresa, empezando por el libro de facturas recibidas de 2025. El nombre y el importe de una empresa proveedora se pueden publicar. El de una persona física (autónomos, freelancers, abogados que facturan a su nombre) es un dato personal. Mientras no tengamos su permiso, esas personas aparecerán solo por su función (por ejemplo, «Desarrollo»), sin nombre ni iniciales.</w:t>
+      </w:r>
+    </w:p>
+    <w:p>
+      <w:pPr>
+        <w:pStyle w:val="ListBullet"/>
+      </w:pPr>
+      <w:r>
+        <w:t>[#35] Vamos a pedir un consentimiento firmado a cada persona que nos facturó en 2025 (una ya ha dicho que sí). ¿Podéis redactar ese consentimiento, corto: nombre, función e importes facturados, publicados en numinia.org?</w:t>
+      </w:r>
+    </w:p>
+    <w:p>
+      <w:pPr>
+        <w:pStyle w:val="ListBullet"/>
+      </w:pPr>
+      <w:r>
+        <w:t>[#36] ¿Podéis redactar una cláusula de transparencia para todos los contratos nuevos con freelancers, proveedores y colaboradores? Diría que los importes se publican con nombre y función, y que quien se oponga aparece solo por su función.</w:t>
+      </w:r>
+    </w:p>
+    <w:p>
+      <w:pPr>
+        <w:pStyle w:val="ListBullet"/>
+      </w:pPr>
+      <w:r>
+        <w:t>[#37] ¿Cuál es la base legal correcta: el consentimiento o el interés legítimo? ¿Basta con mostrar solo la función mientras falte el consentimiento? Si alguien retira su consentimiento, ¿qué hacemos con lo ya publicado?</w:t>
+      </w:r>
+    </w:p>
+    <w:p>
+      <w:pPr>
+        <w:pStyle w:val="ListBullet"/>
+      </w:pPr>
+      <w:r>
+        <w:t>[#38] Las nóminas y la Seguridad Social no están en ese libro. En un equipo tan pequeño, publicar el total deja adivinar el sueldo de cada persona. ¿Cómo lo publicamos, o no lo publicamos?</w:t>
+      </w:r>
+    </w:p>
+    <w:p>
+      <w:pPr>
+        <w:pStyle w:val="Heading1"/>
+      </w:pPr>
+      <w:r>
         <w:t>Lo que ya está hecho</w:t>
       </w:r>
     </w:p>

</xml_diff>

<commit_message>
DBT-022 0.3.0: open books — naming the people we pay needs their consent (#593)
* DBT-022 0.3.0: open books — naming the people we pay needs their consent

§1.7 adds five rows (#35–#39): consent from every natural person who invoiced
in 2025 (Christian Märtens already agreed), a transparency clause for new
contracts, the legal basis for counsel, payroll left out of the input VAT
book, and confidential prices in signed contracts. The letter to counsel
gains block 8, in the text and the Word file.

No ledger data enters this repository: the FY2025 book stays out until
these rows close.

* Telemetry: re-seal for DBT-022 0.3.0 (cl100k tokenizer, as CI)

* Telemetry: re-seal at the content head (the seal must follow the last content commit)

---------

Co-authored-by: Ursa Fountain Pen <ursa-numinia@users.noreply.github.com>
</commit_message>
<xml_diff>
--- a/debt/DBT-022-questions-for-counsel.docx
+++ b/debt/DBT-022-questions-for-counsel.docx
@@ -29,7 +29,7 @@
         <w:t xml:space="preserve">Fecha: </w:t>
       </w:r>
       <w:r>
-        <w:t>29 de septiembre de 2026</w:t>
+        <w:t>30 de septiembre de 2026</w:t>
       </w:r>
     </w:p>
     <w:p>
@@ -641,6 +641,52 @@
         <w:pStyle w:val="Heading1"/>
       </w:pPr>
       <w:r>
+        <w:t>8. Cuentas abiertas: publicar lo que pagamos a personas</w:t>
+      </w:r>
+    </w:p>
+    <w:p>
+      <w:pPr/>
+      <w:r>
+        <w:t>Queremos publicar en numinia.org las cuentas reales de la empresa, empezando por el libro de facturas recibidas de 2025. El nombre y el importe de una empresa proveedora se pueden publicar. El de una persona física (autónomos, freelancers, abogados que facturan a su nombre) es un dato personal. Mientras no tengamos su permiso, esas personas aparecerán solo por su función (por ejemplo, «Desarrollo»), sin nombre ni iniciales.</w:t>
+      </w:r>
+    </w:p>
+    <w:p>
+      <w:pPr>
+        <w:pStyle w:val="ListBullet"/>
+      </w:pPr>
+      <w:r>
+        <w:t>[#35] Vamos a pedir un consentimiento firmado a cada persona que nos facturó en 2025 (una ya ha dicho que sí). ¿Podéis redactar ese consentimiento, corto: nombre, función e importes facturados, publicados en numinia.org?</w:t>
+      </w:r>
+    </w:p>
+    <w:p>
+      <w:pPr>
+        <w:pStyle w:val="ListBullet"/>
+      </w:pPr>
+      <w:r>
+        <w:t>[#36] ¿Podéis redactar una cláusula de transparencia para todos los contratos nuevos con freelancers, proveedores y colaboradores? Diría que los importes se publican con nombre y función, y que quien se oponga aparece solo por su función.</w:t>
+      </w:r>
+    </w:p>
+    <w:p>
+      <w:pPr>
+        <w:pStyle w:val="ListBullet"/>
+      </w:pPr>
+      <w:r>
+        <w:t>[#37] ¿Cuál es la base legal correcta: el consentimiento o el interés legítimo? ¿Basta con mostrar solo la función mientras falte el consentimiento? Si alguien retira su consentimiento, ¿qué hacemos con lo ya publicado?</w:t>
+      </w:r>
+    </w:p>
+    <w:p>
+      <w:pPr>
+        <w:pStyle w:val="ListBullet"/>
+      </w:pPr>
+      <w:r>
+        <w:t>[#38] Las nóminas y la Seguridad Social no están en ese libro. En un equipo tan pequeño, publicar el total deja adivinar el sueldo de cada persona. ¿Cómo lo publicamos, o no lo publicamos?</w:t>
+      </w:r>
+    </w:p>
+    <w:p>
+      <w:pPr>
+        <w:pStyle w:val="Heading1"/>
+      </w:pPr>
+      <w:r>
         <w:t>Lo que ya está hecho</w:t>
       </w:r>
     </w:p>

</xml_diff>